<commit_message>
refactor: imagOperator variable names
</commit_message>
<xml_diff>
--- a/A4/A4.docx
+++ b/A4/A4.docx
@@ -136,13 +136,22 @@
         </w:rPr>
         <w:t>0.78s:</w:t>
       </w:r>
+      <w:proofErr w:type="gramStart"/>
       <w:r>
         <w:rPr>
           <w:rFonts w:ascii="Times New Roman" w:hAnsi="Times New Roman" w:cs="Times New Roman"/>
           <w:lang w:val="en-CA"/>
         </w:rPr>
         <w:tab/>
-        <w:t xml:space="preserve">  500Hz</w:t>
+        <w:t xml:space="preserve">  500</w:t>
+      </w:r>
+      <w:proofErr w:type="gramEnd"/>
+      <w:r>
+        <w:rPr>
+          <w:rFonts w:ascii="Times New Roman" w:hAnsi="Times New Roman" w:cs="Times New Roman"/>
+          <w:lang w:val="en-CA"/>
+        </w:rPr>
+        <w:t>Hz</w:t>
       </w:r>
     </w:p>
     <w:p>
@@ -159,13 +168,22 @@
         </w:rPr>
         <w:t xml:space="preserve">1.1s: </w:t>
       </w:r>
+      <w:proofErr w:type="gramStart"/>
       <w:r>
         <w:rPr>
           <w:rFonts w:ascii="Times New Roman" w:hAnsi="Times New Roman" w:cs="Times New Roman"/>
           <w:lang w:val="en-CA"/>
         </w:rPr>
         <w:tab/>
-        <w:t xml:space="preserve">  600Hz</w:t>
+        <w:t xml:space="preserve">  600</w:t>
+      </w:r>
+      <w:proofErr w:type="gramEnd"/>
+      <w:r>
+        <w:rPr>
+          <w:rFonts w:ascii="Times New Roman" w:hAnsi="Times New Roman" w:cs="Times New Roman"/>
+          <w:lang w:val="en-CA"/>
+        </w:rPr>
+        <w:t>Hz</w:t>
       </w:r>
     </w:p>
     <w:p>
@@ -182,13 +200,22 @@
         </w:rPr>
         <w:t>1.35s</w:t>
       </w:r>
+      <w:proofErr w:type="gramStart"/>
       <w:r>
         <w:rPr>
           <w:rFonts w:ascii="Times New Roman" w:hAnsi="Times New Roman" w:cs="Times New Roman"/>
           <w:lang w:val="en-CA"/>
         </w:rPr>
         <w:tab/>
-        <w:t xml:space="preserve">  800Hz</w:t>
+        <w:t xml:space="preserve">  800</w:t>
+      </w:r>
+      <w:proofErr w:type="gramEnd"/>
+      <w:r>
+        <w:rPr>
+          <w:rFonts w:ascii="Times New Roman" w:hAnsi="Times New Roman" w:cs="Times New Roman"/>
+          <w:lang w:val="en-CA"/>
+        </w:rPr>
+        <w:t>Hz</w:t>
       </w:r>
     </w:p>
     <w:p>
@@ -213,13 +240,22 @@
         </w:rPr>
         <w:t xml:space="preserve">2s: </w:t>
       </w:r>
+      <w:proofErr w:type="gramStart"/>
       <w:r>
         <w:rPr>
           <w:rFonts w:ascii="Times New Roman" w:hAnsi="Times New Roman" w:cs="Times New Roman"/>
           <w:lang w:val="en-CA"/>
         </w:rPr>
         <w:tab/>
-        <w:t xml:space="preserve">  589.66Hz and 1179Hz (overtone of 589Hz)</w:t>
+        <w:t xml:space="preserve">  589</w:t>
+      </w:r>
+      <w:proofErr w:type="gramEnd"/>
+      <w:r>
+        <w:rPr>
+          <w:rFonts w:ascii="Times New Roman" w:hAnsi="Times New Roman" w:cs="Times New Roman"/>
+          <w:lang w:val="en-CA"/>
+        </w:rPr>
+        <w:t>.66Hz and 1179Hz (overtone of 589Hz)</w:t>
       </w:r>
     </w:p>
     <w:p>
@@ -412,7 +448,15 @@
         <w:spacing w:after="0" w:line="240" w:lineRule="auto"/>
       </w:pPr>
       <w:r>
-        <w:t>I selected the first 5 seconds of the audio because this portion is less dense and easier to analyze. When fewer notes overlap, it becomes easier to identify individual pitches.</w:t>
+        <w:t xml:space="preserve">I selected the first 5 seconds of the audio because this portion is less dense and easier to </w:t>
+      </w:r>
+      <w:proofErr w:type="spellStart"/>
+      <w:r>
+        <w:t>analyze</w:t>
+      </w:r>
+      <w:proofErr w:type="spellEnd"/>
+      <w:r>
+        <w:t>. When fewer notes overlap, it becomes easier to identify individual pitches.</w:t>
       </w:r>
       <w:r>
         <w:br/>
@@ -447,7 +491,15 @@
         <w:t>NFFT</w:t>
       </w:r>
       <w:r>
-        <w:t xml:space="preserve"> (number of fast fourier transform)</w:t>
+        <w:t xml:space="preserve"> (number of fast </w:t>
+      </w:r>
+      <w:proofErr w:type="spellStart"/>
+      <w:r>
+        <w:t>fourier</w:t>
+      </w:r>
+      <w:proofErr w:type="spellEnd"/>
+      <w:r>
+        <w:t xml:space="preserve"> transform)</w:t>
       </w:r>
       <w:r>
         <w:t xml:space="preserve"> (8192):</w:t>
@@ -504,10 +556,91 @@
           <w:lang w:val="en-CA"/>
         </w:rPr>
       </w:pPr>
-      <w:r>
-        <w:rPr>
-          <w:lang w:val="en-CA"/>
-        </w:rPr>
+    </w:p>
+    <w:p>
+      <w:pPr>
+        <w:pStyle w:val="NormalWeb"/>
+        <w:rPr>
+          <w:lang w:val="en-CA"/>
+        </w:rPr>
+      </w:pPr>
+    </w:p>
+    <w:p>
+      <w:pPr>
+        <w:pStyle w:val="NormalWeb"/>
+        <w:rPr>
+          <w:lang w:val="en-CA"/>
+        </w:rPr>
+      </w:pPr>
+    </w:p>
+    <w:p>
+      <w:pPr>
+        <w:pStyle w:val="NormalWeb"/>
+        <w:rPr>
+          <w:lang w:val="en-CA"/>
+        </w:rPr>
+      </w:pPr>
+    </w:p>
+    <w:p>
+      <w:pPr>
+        <w:pStyle w:val="NormalWeb"/>
+        <w:rPr>
+          <w:lang w:val="en-CA"/>
+        </w:rPr>
+      </w:pPr>
+    </w:p>
+    <w:p>
+      <w:pPr>
+        <w:pStyle w:val="NormalWeb"/>
+        <w:rPr>
+          <w:lang w:val="en-CA"/>
+        </w:rPr>
+      </w:pPr>
+    </w:p>
+    <w:p>
+      <w:pPr>
+        <w:pStyle w:val="NormalWeb"/>
+        <w:rPr>
+          <w:lang w:val="en-CA"/>
+        </w:rPr>
+      </w:pPr>
+    </w:p>
+    <w:p>
+      <w:pPr>
+        <w:pStyle w:val="NormalWeb"/>
+        <w:rPr>
+          <w:lang w:val="en-CA"/>
+        </w:rPr>
+      </w:pPr>
+    </w:p>
+    <w:p>
+      <w:pPr>
+        <w:pStyle w:val="NormalWeb"/>
+        <w:rPr>
+          <w:lang w:val="en-CA"/>
+        </w:rPr>
+      </w:pPr>
+    </w:p>
+    <w:p>
+      <w:pPr>
+        <w:pStyle w:val="NormalWeb"/>
+        <w:rPr>
+          <w:lang w:val="en-CA"/>
+        </w:rPr>
+      </w:pPr>
+    </w:p>
+    <w:p>
+      <w:pPr>
+        <w:pStyle w:val="NormalWeb"/>
+        <w:rPr>
+          <w:lang w:val="en-CA"/>
+        </w:rPr>
+      </w:pPr>
+      <w:r>
+        <w:rPr>
+          <w:lang w:val="en-CA"/>
+        </w:rPr>
+        <w:lastRenderedPageBreak/>
         <w:t>Q2. 2</w:t>
       </w:r>
     </w:p>
@@ -524,64 +657,22 @@
         </w:rPr>
         <w:t>In the spectrum of the original signal: the graph is smooth, with only one single spike at frequency = 440Hz.</w:t>
       </w:r>
-    </w:p>
-    <w:p>
-      <w:pPr>
-        <w:pStyle w:val="NormalWeb"/>
-        <w:rPr>
-          <w:lang w:val="en-CA"/>
-        </w:rPr>
-      </w:pPr>
-      <w:r>
-        <w:rPr>
-          <w:lang w:val="en-CA"/>
-        </w:rPr>
-        <w:t>In the spectrum of quantized signal: there is still the biggest spike at frequency = 440Hz but also other error frequencies at different level</w:t>
-      </w:r>
-      <w:r>
-        <w:rPr>
-          <w:rFonts w:hint="eastAsia"/>
-          <w:lang w:val="en-CA"/>
-        </w:rPr>
-        <w:t xml:space="preserve"> causing </w:t>
-      </w:r>
-      <w:r>
-        <w:rPr>
-          <w:lang w:val="en-CA"/>
-        </w:rPr>
-        <w:t xml:space="preserve">steps in the amplitude. </w:t>
-      </w:r>
-    </w:p>
-    <w:p>
-      <w:pPr>
-        <w:pStyle w:val="NormalWeb"/>
-        <w:rPr>
-          <w:lang w:val="en-CA"/>
-        </w:rPr>
-      </w:pPr>
-      <w:r>
-        <w:rPr>
-          <w:lang w:val="en-CA"/>
-        </w:rPr>
-        <w:t>In the spectrum of dithered signal: The error is spread out randomly, making the error less noticeable by human ear. We can see the spectrum is smoother too.</w:t>
-      </w:r>
-    </w:p>
-    <w:p>
-      <w:pPr>
-        <w:pStyle w:val="NormalWeb"/>
-        <w:rPr>
-          <w:lang w:val="en-CA"/>
-        </w:rPr>
-      </w:pPr>
       <w:r>
         <w:rPr>
           <w:noProof/>
           <w:lang w:val="en-CA"/>
           <w14:ligatures w14:val="standardContextual"/>
         </w:rPr>
-        <w:lastRenderedPageBreak/>
+        <w:t xml:space="preserve"> </w:t>
+      </w:r>
+      <w:r>
+        <w:rPr>
+          <w:noProof/>
+          <w:lang w:val="en-CA"/>
+          <w14:ligatures w14:val="standardContextual"/>
+        </w:rPr>
         <w:drawing>
-          <wp:inline distT="0" distB="0" distL="0" distR="0" wp14:anchorId="7A307041" wp14:editId="62DC3279">
+          <wp:inline distT="0" distB="0" distL="0" distR="0" wp14:anchorId="1E250951" wp14:editId="7D0F41F8">
             <wp:extent cx="5731510" cy="3407410"/>
             <wp:effectExtent l="0" t="0" r="0" b="0"/>
             <wp:docPr id="446481246" name="Picture 1"/>
@@ -631,7 +722,161 @@
         </w:rPr>
       </w:pPr>
       <w:r>
-        <w:t>In the undithered signal, the spectrum shows extra sharp peaks caused by quantization distortion. These peaks are structured and sound harsh.</w:t>
+        <w:rPr>
+          <w:lang w:val="en-CA"/>
+        </w:rPr>
+        <w:t>In the spectrum of quantized signal: there is still the biggest spike at frequency = 440Hz but also other error frequencies at different level</w:t>
+      </w:r>
+      <w:r>
+        <w:rPr>
+          <w:rFonts w:hint="eastAsia"/>
+          <w:lang w:val="en-CA"/>
+        </w:rPr>
+        <w:t xml:space="preserve"> causing </w:t>
+      </w:r>
+      <w:r>
+        <w:rPr>
+          <w:lang w:val="en-CA"/>
+        </w:rPr>
+        <w:t xml:space="preserve">steps in the amplitude. </w:t>
+      </w:r>
+      <w:r>
+        <w:rPr>
+          <w:noProof/>
+          <w:lang w:val="en-CA"/>
+          <w14:ligatures w14:val="standardContextual"/>
+        </w:rPr>
+        <w:drawing>
+          <wp:inline distT="0" distB="0" distL="0" distR="0" wp14:anchorId="05EF13DB" wp14:editId="7156FCCC">
+            <wp:extent cx="5731510" cy="3407410"/>
+            <wp:effectExtent l="0" t="0" r="0" b="0"/>
+            <wp:docPr id="1735864571" name="Picture 2"/>
+            <wp:cNvGraphicFramePr>
+              <a:graphicFrameLocks xmlns:a="http://schemas.openxmlformats.org/drawingml/2006/main" noChangeAspect="1"/>
+            </wp:cNvGraphicFramePr>
+            <a:graphic xmlns:a="http://schemas.openxmlformats.org/drawingml/2006/main">
+              <a:graphicData uri="http://schemas.openxmlformats.org/drawingml/2006/picture">
+                <pic:pic xmlns:pic="http://schemas.openxmlformats.org/drawingml/2006/picture">
+                  <pic:nvPicPr>
+                    <pic:cNvPr id="1735864571" name="Picture 1735864571"/>
+                    <pic:cNvPicPr/>
+                  </pic:nvPicPr>
+                  <pic:blipFill>
+                    <a:blip r:embed="rId5">
+                      <a:extLst>
+                        <a:ext uri="{28A0092B-C50C-407E-A947-70E740481C1C}">
+                          <a14:useLocalDpi xmlns:a14="http://schemas.microsoft.com/office/drawing/2010/main" val="0"/>
+                        </a:ext>
+                      </a:extLst>
+                    </a:blip>
+                    <a:stretch>
+                      <a:fillRect/>
+                    </a:stretch>
+                  </pic:blipFill>
+                  <pic:spPr>
+                    <a:xfrm>
+                      <a:off x="0" y="0"/>
+                      <a:ext cx="5731510" cy="3407410"/>
+                    </a:xfrm>
+                    <a:prstGeom prst="rect">
+                      <a:avLst/>
+                    </a:prstGeom>
+                  </pic:spPr>
+                </pic:pic>
+              </a:graphicData>
+            </a:graphic>
+          </wp:inline>
+        </w:drawing>
+      </w:r>
+    </w:p>
+    <w:p>
+      <w:pPr>
+        <w:pStyle w:val="NormalWeb"/>
+        <w:rPr>
+          <w:lang w:val="en-CA"/>
+        </w:rPr>
+      </w:pPr>
+      <w:r>
+        <w:rPr>
+          <w:lang w:val="en-CA"/>
+        </w:rPr>
+        <w:lastRenderedPageBreak/>
+        <w:t>In the spectrum of dithered signal: The error is spread out randomly, making the error less noticeable by human ear. We can see the spectrum is smoother too.</w:t>
+      </w:r>
+      <w:r>
+        <w:rPr>
+          <w:noProof/>
+          <w:lang w:val="en-CA"/>
+          <w14:ligatures w14:val="standardContextual"/>
+        </w:rPr>
+        <w:drawing>
+          <wp:inline distT="0" distB="0" distL="0" distR="0" wp14:anchorId="5516E5CA" wp14:editId="09328AD6">
+            <wp:extent cx="5731510" cy="3380105"/>
+            <wp:effectExtent l="0" t="0" r="0" b="0"/>
+            <wp:docPr id="542888815" name="Picture 3"/>
+            <wp:cNvGraphicFramePr>
+              <a:graphicFrameLocks xmlns:a="http://schemas.openxmlformats.org/drawingml/2006/main" noChangeAspect="1"/>
+            </wp:cNvGraphicFramePr>
+            <a:graphic xmlns:a="http://schemas.openxmlformats.org/drawingml/2006/main">
+              <a:graphicData uri="http://schemas.openxmlformats.org/drawingml/2006/picture">
+                <pic:pic xmlns:pic="http://schemas.openxmlformats.org/drawingml/2006/picture">
+                  <pic:nvPicPr>
+                    <pic:cNvPr id="542888815" name="Picture 542888815"/>
+                    <pic:cNvPicPr/>
+                  </pic:nvPicPr>
+                  <pic:blipFill>
+                    <a:blip r:embed="rId6">
+                      <a:extLst>
+                        <a:ext uri="{28A0092B-C50C-407E-A947-70E740481C1C}">
+                          <a14:useLocalDpi xmlns:a14="http://schemas.microsoft.com/office/drawing/2010/main" val="0"/>
+                        </a:ext>
+                      </a:extLst>
+                    </a:blip>
+                    <a:stretch>
+                      <a:fillRect/>
+                    </a:stretch>
+                  </pic:blipFill>
+                  <pic:spPr>
+                    <a:xfrm>
+                      <a:off x="0" y="0"/>
+                      <a:ext cx="5731510" cy="3380105"/>
+                    </a:xfrm>
+                    <a:prstGeom prst="rect">
+                      <a:avLst/>
+                    </a:prstGeom>
+                  </pic:spPr>
+                </pic:pic>
+              </a:graphicData>
+            </a:graphic>
+          </wp:inline>
+        </w:drawing>
+      </w:r>
+    </w:p>
+    <w:p>
+      <w:pPr>
+        <w:pStyle w:val="NormalWeb"/>
+        <w:rPr>
+          <w:lang w:val="en-CA"/>
+        </w:rPr>
+      </w:pPr>
+    </w:p>
+    <w:p>
+      <w:pPr>
+        <w:pStyle w:val="NormalWeb"/>
+        <w:rPr>
+          <w:lang w:val="en-CA"/>
+        </w:rPr>
+      </w:pPr>
+      <w:r>
+        <w:t xml:space="preserve">In the </w:t>
+      </w:r>
+      <w:proofErr w:type="spellStart"/>
+      <w:r>
+        <w:t>undithered</w:t>
+      </w:r>
+      <w:proofErr w:type="spellEnd"/>
+      <w:r>
+        <w:t xml:space="preserve"> signal, the spectrum shows extra sharp peaks caused by quantization distortion. These peaks are structured and sound harsh.</w:t>
       </w:r>
       <w:r>
         <w:br/>

</xml_diff>

<commit_message>
progress: last commit for deliuverables
</commit_message>
<xml_diff>
--- a/A4/A4.docx
+++ b/A4/A4.docx
@@ -75,21 +75,7 @@
           <w:rFonts w:ascii="Times New Roman" w:hAnsi="Times New Roman" w:cs="Times New Roman"/>
           <w:lang w:val="en-CA"/>
         </w:rPr>
-        <w:t>(</w:t>
-      </w:r>
-      <w:r>
-        <w:rPr>
-          <w:rFonts w:ascii="Times New Roman" w:hAnsi="Times New Roman" w:cs="Times New Roman"/>
-          <w:lang w:val="en-CA"/>
-        </w:rPr>
-        <w:t>overtone</w:t>
-      </w:r>
-      <w:r>
-        <w:rPr>
-          <w:rFonts w:ascii="Times New Roman" w:hAnsi="Times New Roman" w:cs="Times New Roman"/>
-          <w:lang w:val="en-CA"/>
-        </w:rPr>
-        <w:t>)</w:t>
+        <w:t>(overtone)</w:t>
       </w:r>
     </w:p>
     <w:p>
@@ -136,22 +122,13 @@
         </w:rPr>
         <w:t>0.78s:</w:t>
       </w:r>
-      <w:proofErr w:type="gramStart"/>
       <w:r>
         <w:rPr>
           <w:rFonts w:ascii="Times New Roman" w:hAnsi="Times New Roman" w:cs="Times New Roman"/>
           <w:lang w:val="en-CA"/>
         </w:rPr>
         <w:tab/>
-        <w:t xml:space="preserve">  500</w:t>
-      </w:r>
-      <w:proofErr w:type="gramEnd"/>
-      <w:r>
-        <w:rPr>
-          <w:rFonts w:ascii="Times New Roman" w:hAnsi="Times New Roman" w:cs="Times New Roman"/>
-          <w:lang w:val="en-CA"/>
-        </w:rPr>
-        <w:t>Hz</w:t>
+        <w:t xml:space="preserve">  500Hz</w:t>
       </w:r>
     </w:p>
     <w:p>
@@ -168,22 +145,13 @@
         </w:rPr>
         <w:t xml:space="preserve">1.1s: </w:t>
       </w:r>
-      <w:proofErr w:type="gramStart"/>
       <w:r>
         <w:rPr>
           <w:rFonts w:ascii="Times New Roman" w:hAnsi="Times New Roman" w:cs="Times New Roman"/>
           <w:lang w:val="en-CA"/>
         </w:rPr>
         <w:tab/>
-        <w:t xml:space="preserve">  600</w:t>
-      </w:r>
-      <w:proofErr w:type="gramEnd"/>
-      <w:r>
-        <w:rPr>
-          <w:rFonts w:ascii="Times New Roman" w:hAnsi="Times New Roman" w:cs="Times New Roman"/>
-          <w:lang w:val="en-CA"/>
-        </w:rPr>
-        <w:t>Hz</w:t>
+        <w:t xml:space="preserve">  600Hz</w:t>
       </w:r>
     </w:p>
     <w:p>
@@ -200,22 +168,13 @@
         </w:rPr>
         <w:t>1.35s</w:t>
       </w:r>
-      <w:proofErr w:type="gramStart"/>
       <w:r>
         <w:rPr>
           <w:rFonts w:ascii="Times New Roman" w:hAnsi="Times New Roman" w:cs="Times New Roman"/>
           <w:lang w:val="en-CA"/>
         </w:rPr>
         <w:tab/>
-        <w:t xml:space="preserve">  800</w:t>
-      </w:r>
-      <w:proofErr w:type="gramEnd"/>
-      <w:r>
-        <w:rPr>
-          <w:rFonts w:ascii="Times New Roman" w:hAnsi="Times New Roman" w:cs="Times New Roman"/>
-          <w:lang w:val="en-CA"/>
-        </w:rPr>
-        <w:t>Hz</w:t>
+        <w:t xml:space="preserve">  800Hz</w:t>
       </w:r>
     </w:p>
     <w:p>
@@ -240,22 +199,13 @@
         </w:rPr>
         <w:t xml:space="preserve">2s: </w:t>
       </w:r>
-      <w:proofErr w:type="gramStart"/>
       <w:r>
         <w:rPr>
           <w:rFonts w:ascii="Times New Roman" w:hAnsi="Times New Roman" w:cs="Times New Roman"/>
           <w:lang w:val="en-CA"/>
         </w:rPr>
         <w:tab/>
-        <w:t xml:space="preserve">  589</w:t>
-      </w:r>
-      <w:proofErr w:type="gramEnd"/>
-      <w:r>
-        <w:rPr>
-          <w:rFonts w:ascii="Times New Roman" w:hAnsi="Times New Roman" w:cs="Times New Roman"/>
-          <w:lang w:val="en-CA"/>
-        </w:rPr>
-        <w:t>.66Hz and 1179Hz (overtone of 589Hz)</w:t>
+        <w:t xml:space="preserve">  589.66Hz and 1179Hz (overtone of 589Hz)</w:t>
       </w:r>
     </w:p>
     <w:p>
@@ -863,9 +813,6 @@
     <w:p>
       <w:pPr>
         <w:pStyle w:val="NormalWeb"/>
-        <w:rPr>
-          <w:lang w:val="en-CA"/>
-        </w:rPr>
       </w:pPr>
       <w:r>
         <w:t xml:space="preserve">In the </w:t>
@@ -881,6 +828,166 @@
       <w:r>
         <w:br/>
         <w:t>In the dithered signal, the distortion is spread out as noise instead of sharp peaks. This makes it sound smoother and less unpleasant, since random noise is less noticeable than structured distortion.</w:t>
+      </w:r>
+    </w:p>
+    <w:p>
+      <w:pPr>
+        <w:pStyle w:val="NormalWeb"/>
+      </w:pPr>
+    </w:p>
+    <w:p>
+      <w:pPr>
+        <w:pStyle w:val="NormalWeb"/>
+      </w:pPr>
+    </w:p>
+    <w:p>
+      <w:pPr>
+        <w:pStyle w:val="NormalWeb"/>
+      </w:pPr>
+    </w:p>
+    <w:p>
+      <w:pPr>
+        <w:pStyle w:val="NormalWeb"/>
+      </w:pPr>
+    </w:p>
+    <w:p>
+      <w:pPr>
+        <w:pStyle w:val="NormalWeb"/>
+      </w:pPr>
+    </w:p>
+    <w:p>
+      <w:pPr>
+        <w:pStyle w:val="NormalWeb"/>
+      </w:pPr>
+    </w:p>
+    <w:p>
+      <w:pPr>
+        <w:pStyle w:val="NormalWeb"/>
+      </w:pPr>
+    </w:p>
+    <w:p>
+      <w:pPr>
+        <w:pStyle w:val="NormalWeb"/>
+      </w:pPr>
+    </w:p>
+    <w:p>
+      <w:pPr>
+        <w:pStyle w:val="NormalWeb"/>
+      </w:pPr>
+    </w:p>
+    <w:p>
+      <w:pPr>
+        <w:pStyle w:val="NormalWeb"/>
+      </w:pPr>
+    </w:p>
+    <w:p>
+      <w:pPr>
+        <w:pStyle w:val="NormalWeb"/>
+      </w:pPr>
+      <w:r>
+        <w:lastRenderedPageBreak/>
+        <w:t>Q3:</w:t>
+      </w:r>
+    </w:p>
+    <w:p>
+      <w:pPr>
+        <w:pStyle w:val="NormalWeb"/>
+        <w:rPr>
+          <w:lang w:val="en-CA"/>
+        </w:rPr>
+      </w:pPr>
+      <w:r>
+        <w:rPr>
+          <w:lang w:val="en-CA"/>
+        </w:rPr>
+        <w:t>I generated a blurred and noisy version of the cameraman image from what is described in the lecture. From the original formula of Wiener Filter, I am able to implement it to degraded images.</w:t>
+      </w:r>
+    </w:p>
+    <w:p>
+      <w:pPr>
+        <w:pStyle w:val="NormalWeb"/>
+      </w:pPr>
+      <w:r>
+        <w:t>The degraded image was restored using two different power spectra: the true cameraman image spectrum and the spectrum of a building image. Multiple reconstructions were generated by varying the noise power parameter, and the best results were selected based on visual quality and the sum of squared errors (SSE).</w:t>
+      </w:r>
+      <w:r>
+        <w:t>I generated ~10 images for both experiments and found that when parameters are finetuned to the best, using building power spectr</w:t>
+      </w:r>
+      <w:r>
+        <w:t>um</w:t>
+      </w:r>
+      <w:r>
+        <w:t xml:space="preserve"> is worse than using cameraman spectrum</w:t>
+      </w:r>
+      <w:r>
+        <w:t>.</w:t>
+      </w:r>
+    </w:p>
+    <w:p>
+      <w:pPr>
+        <w:pStyle w:val="NormalWeb"/>
+      </w:pPr>
+      <w:r>
+        <w:t>The resulting SSE values are:</w:t>
+      </w:r>
+    </w:p>
+    <w:p>
+      <w:pPr>
+        <w:spacing w:after="0" w:line="240" w:lineRule="auto"/>
+        <w:rPr>
+          <w:rFonts w:ascii="Times New Roman" w:eastAsia="Times New Roman" w:hAnsi="Times New Roman" w:cs="Times New Roman"/>
+          <w:kern w:val="0"/>
+          <w14:ligatures w14:val="none"/>
+        </w:rPr>
+      </w:pPr>
+      <w:r>
+        <w:rPr>
+          <w:rFonts w:ascii="Times New Roman" w:eastAsia="Times New Roman" w:hAnsi="Symbol" w:cs="Times New Roman"/>
+          <w:kern w:val="0"/>
+          <w14:ligatures w14:val="none"/>
+        </w:rPr>
+        <w:t></w:t>
+      </w:r>
+      <w:r>
+        <w:rPr>
+          <w:rFonts w:ascii="Times New Roman" w:eastAsia="Times New Roman" w:hAnsi="Times New Roman" w:cs="Times New Roman"/>
+          <w:kern w:val="0"/>
+          <w14:ligatures w14:val="none"/>
+        </w:rPr>
+        <w:t xml:space="preserve">  Cameraman spectrum: </w:t>
+      </w:r>
+      <w:r>
+        <w:rPr>
+          <w:rFonts w:ascii="Times New Roman" w:eastAsia="Times New Roman" w:hAnsi="Times New Roman" w:cs="Times New Roman"/>
+          <w:kern w:val="0"/>
+          <w14:ligatures w14:val="none"/>
+        </w:rPr>
+        <w:t>201</w:t>
+      </w:r>
+    </w:p>
+    <w:p>
+      <w:pPr>
+        <w:pStyle w:val="NormalWeb"/>
+      </w:pPr>
+      <w:r>
+        <w:rPr>
+          <w:rFonts w:hAnsi="Symbol"/>
+        </w:rPr>
+        <w:t></w:t>
+      </w:r>
+      <w:r>
+        <w:t xml:space="preserve">  Building spectrum:</w:t>
+      </w:r>
+      <w:r>
+        <w:t xml:space="preserve"> 260</w:t>
+      </w:r>
+    </w:p>
+    <w:p>
+      <w:pPr>
+        <w:pStyle w:val="NormalWeb"/>
+      </w:pPr>
+      <w:r>
+        <w:t>The result using the cameraman spectrum produced a lower SSE and visually better reconstruction. This is because the Wiener filter relies on an accurate estimate of the image power spectrum. Using an incorrect spectrum (building) leads to poorer restoration.</w:t>
       </w:r>
     </w:p>
     <w:sectPr>

</xml_diff>